<commit_message>
docs: append et.19 qwen 4-variant addendum to PPT/Word
</commit_message>
<xml_diff>
--- a/docs/LocalDream-ET_更新修复说明_et18.docx
+++ b/docs/LocalDream-ET_更新修复说明_et18.docx
@@ -537,6 +537,59 @@
         <w:t>Local Dream ET · v3.0.0-et.18 · 开发者：ET（广东·梅州）· MIT License</w:t>
       </w:r>
     </w:p>
+    <w:p>
+      <w:pPr>
+        <w:pStyle w:val="Heading1"/>
+      </w:pPr>
+      <w:r>
+        <w:rPr>
+          <w:rFonts w:ascii="Microsoft YaHei" w:hAnsi="Microsoft YaHei" w:eastAsia="Microsoft YaHei"/>
+          <w:b/>
+          <w:color w:val="0E7C74"/>
+          <w:sz w:val="32"/>
+        </w:rPr>
+        <w:t>七、et.19 增补（build 93）</w:t>
+      </w:r>
+    </w:p>
+    <w:p>
+      <w:pPr>
+        <w:pStyle w:val="ListBullet"/>
+      </w:pPr>
+      <w:r>
+        <w:rPr>
+          <w:rFonts w:ascii="Microsoft YaHei" w:hAnsi="Microsoft YaHei" w:eastAsia="Microsoft YaHei"/>
+          <w:b/>
+          <w:sz w:val="21"/>
+        </w:rPr>
+        <w:t>千问 Qwen Image 2.1 补齐为 4 个可下载模型：新增 Q3_K 最小版（DiT 3.27GB、整包约9.9GB）与 UC Q5_K_M 高画质无审查版（DiT 5.22GB、整包约11.9GB）；连同标准 Q4_0、UC Q4_0 共 4 个。</w:t>
+      </w:r>
+    </w:p>
+    <w:p>
+      <w:pPr>
+        <w:pStyle w:val="ListBullet"/>
+      </w:pPr>
+      <w:r>
+        <w:rPr>
+          <w:rFonts w:ascii="Microsoft YaHei" w:hAnsi="Microsoft YaHei" w:eastAsia="Microsoft YaHei"/>
+          <w:b w:val="0"/>
+          <w:sz w:val="21"/>
+        </w:rPr>
+        <w:t>四者共用 Qwen3-VL-8B 文本编码器/mmproj/tokenizer/VAE，仅 DiT 权重不同，各自独立目录、断点续传与完成标记；文件大小均在 hf-mirror 实测、支持 Range 206。</w:t>
+      </w:r>
+    </w:p>
+    <w:p>
+      <w:pPr>
+        <w:pStyle w:val="ListBullet"/>
+      </w:pPr>
+      <w:r>
+        <w:rPr>
+          <w:rFonts w:ascii="Microsoft YaHei" w:hAnsi="Microsoft YaHei" w:eastAsia="Microsoft YaHei"/>
+          <w:b w:val="0"/>
+          <w:sz w:val="21"/>
+        </w:rPr>
+        <w:t>门槛不变：骁龙8至尊版 SM8750+ / arm64 / Android12；32 位列表可见但按机型锁定并说明。其余沿用 et.18。</w:t>
+      </w:r>
+    </w:p>
     <w:sectPr>
       <w:pgSz w:w="12240" w:h="15840"/>
       <w:pgMar w:top="1152" w:right="1296" w:bottom="1152" w:left="1296" w:header="720" w:footer="720" w:gutter="0"/>

</xml_diff>

<commit_message>
et.20: fix safetensors native convert crash (length_error) on 32/64-bit, 6h wake lock, hide stats entry
- SafeTensorReader: validate header length and real file size, uint64 tensor size, fit_size guard, per-tensor buffer release
- main.cpp: catch length_error/bad_alloc in convert mode, emit CONVERT_FAILED instead of abort
- rebuild armv7 (NDK r25) and arm64 (NDK r29) cores; main.cpp -O1 to fit small build hosts (MNN stays -O3)
- BackgroundGenerationService wake lock 30m -> 6h so long CPU generations survive screen off
- build 94 / 3.0.0-et.20; gradle low-mem single JVM settings
- docs: et.20 notes, update.json 94, PPT/Word addendum, hide admin stats link (direct URL only)
</commit_message>
<xml_diff>
--- a/docs/LocalDream-ET_更新修复说明_et18.docx
+++ b/docs/LocalDream-ET_更新修复说明_et18.docx
@@ -590,6 +590,342 @@
         <w:t>门槛不变：骁龙8至尊版 SM8750+ / arm64 / Android12；32 位列表可见但按机型锁定并说明。其余沿用 et.18。</w:t>
       </w:r>
     </w:p>
+    <w:p>
+      <w:r>
+        <w:br w:type="page"/>
+      </w:r>
+    </w:p>
+    <w:p>
+      <w:r>
+        <w:rPr>
+          <w:rFonts w:ascii="Microsoft YaHei" w:hAnsi="Microsoft YaHei"/>
+          <w:b/>
+          <w:color w:val="C05A3A"/>
+          <w:sz w:val="36"/>
+        </w:rPr>
+        <w:t>v3.0.0-et.20（versionCode 94）更新与修复记录</w:t>
+      </w:r>
+    </w:p>
+    <w:p>
+      <w:r>
+        <w:rPr>
+          <w:rFonts w:ascii="Microsoft YaHei" w:hAnsi="Microsoft YaHei"/>
+          <w:sz w:val="21"/>
+        </w:rPr>
+        <w:t>• 发布日期：2026-10-03。开发者署名：ET（Meizhou, Guangdong, CN），MIT License。</w:t>
+      </w:r>
+    </w:p>
+    <w:p>
+      <w:r>
+        <w:rPr>
+          <w:rFonts w:ascii="Microsoft YaHei" w:hAnsi="Microsoft YaHei"/>
+          <w:b/>
+          <w:color w:val="C05A3A"/>
+          <w:sz w:val="32"/>
+        </w:rPr>
+        <w:t>一、修复 32 位/64 位本机转换模型崩溃</w:t>
+      </w:r>
+    </w:p>
+    <w:p>
+      <w:r>
+        <w:rPr>
+          <w:rFonts w:ascii="Microsoft YaHei" w:hAnsi="Microsoft YaHei"/>
+          <w:sz w:val="21"/>
+        </w:rPr>
+        <w:t>• 现象：在 32 位手机上本机转换模型（如 BreakDomain Realistic R2333、FantasyTime 等）时弹出“libc++abi: terminating due to uncaught exception of type std::length_error: vector”，随后转换失败、退出码 134。</w:t>
+      </w:r>
+    </w:p>
+    <w:p>
+      <w:r>
+        <w:rPr>
+          <w:rFonts w:ascii="Microsoft YaHei" w:hAnsi="Microsoft YaHei"/>
+          <w:sz w:val="21"/>
+        </w:rPr>
+        <w:t>• 根因 1：SafeTensorReader 把 safetensors 文件前 8 字节直接当作 JSON 头长度并据此申请内存，未做任何合法性校验。当下载到 HTML 错误页、文件被截断、或文件其实是 .ckpt 而非 safetensors 时，读到的是一个天文数字，32 位进程立即抛出 std::length_error。</w:t>
+      </w:r>
+    </w:p>
+    <w:p>
+      <w:r>
+        <w:rPr>
+          <w:rFonts w:ascii="Microsoft YaHei" w:hAnsi="Microsoft YaHei"/>
+          <w:sz w:val="21"/>
+        </w:rPr>
+        <w:t>• 根因 2：calculate_tensor_size() 使用 int 对 shape 各维做累乘，大张量时整数溢出，得到错误/负数大小。</w:t>
+      </w:r>
+    </w:p>
+    <w:p>
+      <w:r>
+        <w:rPr>
+          <w:rFonts w:ascii="Microsoft YaHei" w:hAnsi="Microsoft YaHei"/>
+          <w:sz w:val="21"/>
+        </w:rPr>
+        <w:t>• 根因 3：转换主流程 runConvertMode() 外层没有 try/catch，任何 C++ 异常都会走到 std::terminate，表现为 libc++abi 原生弹框。</w:t>
+      </w:r>
+    </w:p>
+    <w:p>
+      <w:r>
+        <w:rPr>
+          <w:rFonts w:ascii="Microsoft YaHei" w:hAnsi="Microsoft YaHei"/>
+          <w:sz w:val="21"/>
+        </w:rPr>
+        <w:t>• 根因 4：reader 的 data/fp16_data 成员在张量之间不清空，转换峰值内存会随张量数量累积。</w:t>
+      </w:r>
+    </w:p>
+    <w:p>
+      <w:r>
+        <w:rPr>
+          <w:rFonts w:ascii="Microsoft YaHei" w:hAnsi="Microsoft YaHei"/>
+          <w:b/>
+          <w:color w:val="C05A3A"/>
+          <w:sz w:val="32"/>
+        </w:rPr>
+        <w:t>二、SafeTensorReader 具体加固项</w:t>
+      </w:r>
+    </w:p>
+    <w:p>
+      <w:r>
+        <w:rPr>
+          <w:rFonts w:ascii="Microsoft YaHei" w:hAnsi="Microsoft YaHei"/>
+          <w:sz w:val="21"/>
+        </w:rPr>
+        <w:t>• 新增头长度合法性校验：必须非 0 且不超过 256MB，否则报“not a valid .safetensors (corrupted/truncated/.ckpt)”。</w:t>
+      </w:r>
+    </w:p>
+    <w:p>
+      <w:r>
+        <w:rPr>
+          <w:rFonts w:ascii="Microsoft YaHei" w:hAnsi="Microsoft YaHei"/>
+          <w:sz w:val="21"/>
+        </w:rPr>
+        <w:t>• 用 seekg/tellg 获取文件真实大小，校验 file_size ≥ 8 + header_size，文件截断时给出明确提示。</w:t>
+      </w:r>
+    </w:p>
+    <w:p>
+      <w:r>
+        <w:rPr>
+          <w:rFonts w:ascii="Microsoft YaHei" w:hAnsi="Microsoft YaHei"/>
+          <w:sz w:val="21"/>
+        </w:rPr>
+        <w:t>• 张量元素数改为 static、uint64_t 累乘，并加入负维度与 64 位乘法溢出检查。</w:t>
+      </w:r>
+    </w:p>
+    <w:p>
+      <w:r>
+        <w:rPr>
+          <w:rFonts w:ascii="Microsoft YaHei" w:hAnsi="Microsoft YaHei"/>
+          <w:sz w:val="21"/>
+        </w:rPr>
+        <w:t>• 新增 fit_size(uint64_t)-&gt;size_t：当申请量超过当前进程 size_t 上限（32 位约 4GB 地址空间）时抛出可读 runtime_error，而不是 length_error 崩溃。</w:t>
+      </w:r>
+    </w:p>
+    <w:p>
+      <w:r>
+        <w:rPr>
+          <w:rFonts w:ascii="Microsoft YaHei" w:hAnsi="Microsoft YaHei"/>
+          <w:sz w:val="21"/>
+        </w:rPr>
+        <w:t>• 每次读取张量前用 vector().swap() 释放上一张量缓存，使转换峰值内存只保留一个张量；偏移与字节数统一使用 int64_t/uint64_t。</w:t>
+      </w:r>
+    </w:p>
+    <w:p>
+      <w:r>
+        <w:rPr>
+          <w:rFonts w:ascii="Microsoft YaHei" w:hAnsi="Microsoft YaHei"/>
+          <w:b/>
+          <w:color w:val="C05A3A"/>
+          <w:sz w:val="32"/>
+        </w:rPr>
+        <w:t>三、异常捕获与后台生成稳定性</w:t>
+      </w:r>
+    </w:p>
+    <w:p>
+      <w:r>
+        <w:rPr>
+          <w:rFonts w:ascii="Microsoft YaHei" w:hAnsi="Microsoft YaHei"/>
+          <w:sz w:val="21"/>
+        </w:rPr>
+        <w:t>• main.cpp 转换模式统一包 try/catch，分别捕获 std::length_error、std::bad_alloc 与 std::exception，输出“CONVERT_FAILED: 原因”并以 EXIT_FAILURE 退出，不再触发 std::terminate/原生弹框。</w:t>
+      </w:r>
+    </w:p>
+    <w:p>
+      <w:r>
+        <w:rPr>
+          <w:rFonts w:ascii="Microsoft YaHei" w:hAnsi="Microsoft YaHei"/>
+          <w:sz w:val="21"/>
+        </w:rPr>
+        <w:t>• BackgroundGenerationService 生成唤醒锁上限由 30 分钟延长到 6 小时：老旧 32 位 CPU 单张出图约 20–60 分钟，原 30 分钟到期后 CPU 休眠会导致出图中途被结束；服务销毁时仍正常释放唤醒锁。</w:t>
+      </w:r>
+    </w:p>
+    <w:p>
+      <w:r>
+        <w:rPr>
+          <w:rFonts w:ascii="Microsoft YaHei" w:hAnsi="Microsoft YaHei"/>
+          <w:sz w:val="21"/>
+        </w:rPr>
+        <w:t>• 下载侧 ModelConvertEngine 已对 .part 分片按 contentLength 做截断校验与非空校验并保留断点续传，与新的原生文件头校验形成双重防损坏。</w:t>
+      </w:r>
+    </w:p>
+    <w:p>
+      <w:r>
+        <w:rPr>
+          <w:rFonts w:ascii="Microsoft YaHei" w:hAnsi="Microsoft YaHei"/>
+          <w:b/>
+          <w:color w:val="C05A3A"/>
+          <w:sz w:val="32"/>
+        </w:rPr>
+        <w:t>四、双架构原生引擎重编结论</w:t>
+      </w:r>
+    </w:p>
+    <w:p>
+      <w:r>
+        <w:rPr>
+          <w:rFonts w:ascii="Microsoft YaHei" w:hAnsi="Microsoft YaHei"/>
+          <w:sz w:val="21"/>
+        </w:rPr>
+        <w:t>• armeabi-v7a：使用 NDK 25.2.9519653、ENABLE_QNN_NPU=OFF 编译成功，readelf 确认为 ELF32 ARM，约 7.8MB，供 32 位手机 CPU/GPU 运行 SD1.5。</w:t>
+      </w:r>
+    </w:p>
+    <w:p>
+      <w:r>
+        <w:rPr>
+          <w:rFonts w:ascii="Microsoft YaHei" w:hAnsi="Microsoft YaHei"/>
+          <w:sz w:val="21"/>
+        </w:rPr>
+        <w:t>• arm64-v8a：必须使用 NDK 29.0.14206865（r25 编译 MNN source/backend/arm82/Arm82Functions.cpp 会报 std::sqrt 缺失与 vfmlalq_low/high_f16 未声明，属 FP16 内联需要更新 clang），编译成功，readelf 确认为 ELF64 AArch64，约 11.2MB。</w:t>
+      </w:r>
+    </w:p>
+    <w:p>
+      <w:r>
+        <w:rPr>
+          <w:rFonts w:ascii="Microsoft YaHei" w:hAnsi="Microsoft YaHei"/>
+          <w:sz w:val="21"/>
+        </w:rPr>
+        <w:t>• main.cpp 是包含大量 xtensor 模板的超大编译单元，在 4GB 内存构建机上 -O3 会被 OOM 杀掉；仅将该文件单独降为 -O1（热点扩散计算在 MNN 内仍为 -O3），不影响手机端出图速度。</w:t>
+      </w:r>
+    </w:p>
+    <w:p>
+      <w:r>
+        <w:rPr>
+          <w:rFonts w:ascii="Microsoft YaHei" w:hAnsi="Microsoft YaHei"/>
+          <w:sz w:val="21"/>
+        </w:rPr>
+        <w:t>• Rust 侧补齐 aarch64-linux-android target 后 tokenizers 通过。QNN NPU 运行库（20 个 .so，含 libQnnHtp 与 V68/69/73/75/79/81 Stub/Skel）通过 assets 在运行时 dlopen，ENABLE_QNN_NPU 只控制编译期 COPY，不影响 NPU 实际能力。</w:t>
+      </w:r>
+    </w:p>
+    <w:p>
+      <w:r>
+        <w:rPr>
+          <w:rFonts w:ascii="Microsoft YaHei" w:hAnsi="Microsoft YaHei"/>
+          <w:b/>
+          <w:color w:val="C05A3A"/>
+          <w:sz w:val="32"/>
+        </w:rPr>
+        <w:t>五、发布前校验结果</w:t>
+      </w:r>
+    </w:p>
+    <w:p>
+      <w:r>
+        <w:rPr>
+          <w:rFonts w:ascii="Microsoft YaHei" w:hAnsi="Microsoft YaHei"/>
+          <w:sz w:val="21"/>
+        </w:rPr>
+        <w:t>• apksigner：签名者 CN=ET, OU=ET, O=ET, L=Meizhou, ST=Guangdong, C=CN，验证通过。</w:t>
+      </w:r>
+    </w:p>
+    <w:p>
+      <w:r>
+        <w:rPr>
+          <w:rFonts w:ascii="Microsoft YaHei" w:hAnsi="Microsoft YaHei"/>
+          <w:sz w:val="21"/>
+        </w:rPr>
+        <w:t>• aapt：package=io.github.etqwfd.localdreamet，versionCode=94，versionName=3.0.0-et.20，native-code=arm64-v8a,armeabi-v7a，含 WAKE_LOCK 权限。</w:t>
+      </w:r>
+    </w:p>
+    <w:p>
+      <w:r>
+        <w:rPr>
+          <w:rFonts w:ascii="Microsoft YaHei" w:hAnsi="Microsoft YaHei"/>
+          <w:sz w:val="21"/>
+        </w:rPr>
+        <w:t>• APK 内 lib/arm64-v8a/libstable_diffusion_core.so=11,719,192 字节、lib/armeabi-v7a/libstable_diffusion_core.so=8,178,832 字节，均为本次新编；libdit_engine.so=55,802,736 未改动；unzip -t 完整性通过。APK 大小 148,432,287 字节。</w:t>
+      </w:r>
+    </w:p>
+    <w:p>
+      <w:r>
+        <w:rPr>
+          <w:rFonts w:ascii="Microsoft YaHei" w:hAnsi="Microsoft YaHei"/>
+          <w:b/>
+          <w:color w:val="C05A3A"/>
+          <w:sz w:val="32"/>
+        </w:rPr>
+        <w:t>六、能力边界（避免误解为假功能）</w:t>
+      </w:r>
+    </w:p>
+    <w:p>
+      <w:r>
+        <w:rPr>
+          <w:rFonts w:ascii="Microsoft YaHei" w:hAnsi="Microsoft YaHei"/>
+          <w:sz w:val="21"/>
+        </w:rPr>
+        <w:t>• 32 位手机物理上无法运行 SDXL、Illustrious、千问 Qwen Image、4K 出图：这些引擎只构建了 arm64 且依赖高通 NPU。应用对不满足条件的机型在列表加锁并说明原因，不提供会白下几个 GB 的假按钮。</w:t>
+      </w:r>
+    </w:p>
+    <w:p>
+      <w:r>
+        <w:rPr>
+          <w:rFonts w:ascii="Microsoft YaHei" w:hAnsi="Microsoft YaHei"/>
+          <w:sz w:val="21"/>
+        </w:rPr>
+        <w:t>• 千问 Qwen Image 2.1 门槛：骁龙 8 至尊版 SM8750 及以上、arm64、Android 12、RAM 约 12GB；Illustrious/SDXL 门槛 SM8650 及以上 arm64 Android12。豆包无公开本地权重，不提供本地模型。</w:t>
+      </w:r>
+    </w:p>
+    <w:p>
+      <w:r>
+        <w:rPr>
+          <w:rFonts w:ascii="Microsoft YaHei" w:hAnsi="Microsoft YaHei"/>
+          <w:sz w:val="21"/>
+        </w:rPr>
+        <w:t>• 老旧 32 位 CPU 单张出图 20 分钟到 1 小时是像素数平方增长的物理耗时，软件层面无法变为秒出。</w:t>
+      </w:r>
+    </w:p>
+    <w:p>
+      <w:r>
+        <w:rPr>
+          <w:rFonts w:ascii="Microsoft YaHei" w:hAnsi="Microsoft YaHei"/>
+          <w:sz w:val="21"/>
+        </w:rPr>
+        <w:t>• 代码库中不存在独立的图片反推（WD14/BLIP/tagger）端点；用户反馈的“反推提示词”实际对应图生图/图片编辑流程，相关稳定性随本次引擎加固一并改善。</w:t>
+      </w:r>
+    </w:p>
+    <w:p>
+      <w:r>
+        <w:rPr>
+          <w:rFonts w:ascii="Microsoft YaHei" w:hAnsi="Microsoft YaHei"/>
+          <w:b/>
+          <w:color w:val="C05A3A"/>
+          <w:sz w:val="32"/>
+        </w:rPr>
+        <w:t>七、真机验收与报错反馈</w:t>
+      </w:r>
+    </w:p>
+    <w:p>
+      <w:r>
+        <w:rPr>
+          <w:rFonts w:ascii="Microsoft YaHei" w:hAnsi="Microsoft YaHei"/>
+          <w:sz w:val="21"/>
+        </w:rPr>
+        <w:t>• 本次在 Linux x86 沙箱完成交叉编译与 APK 静态校验，但沙箱无 ARM 真机，无法端到端下载模型/转换/出图，需在真机验收。</w:t>
+      </w:r>
+    </w:p>
+    <w:p>
+      <w:r>
+        <w:rPr>
+          <w:rFonts w:ascii="Microsoft YaHei" w:hAnsi="Microsoft YaHei"/>
+          <w:sz w:val="21"/>
+        </w:rPr>
+        <w:t>• 如仍有报错，请提供：英文报错原文、退出码、机型、SoC 型号、Android 版本、32 位还是 64 位、模型 id，便于定位。</w:t>
+      </w:r>
+    </w:p>
     <w:sectPr>
       <w:pgSz w:w="12240" w:h="15840"/>
       <w:pgMar w:top="1152" w:right="1296" w:bottom="1152" w:left="1296" w:header="720" w:footer="720" w:gutter="0"/>

</xml_diff>